<commit_message>
Cap nhat tieu de 1 dong gon dep, dong bo header footer va chi so hoa hoc
</commit_message>
<xml_diff>
--- a/San_Pham/De_Kiem_Tra_Hoa_11_Ma209.docx
+++ b/San_Pham/De_Kiem_Tra_Hoa_11_Ma209.docx
@@ -23,7 +23,7 @@
       <w:tr>
         <w:tc>
           <w:tcPr>
-            <w:tcW w:type="dxa" w:w="4252"/>
+            <w:tcW w:type="dxa" w:w="3685"/>
           </w:tcPr>
           <w:p>
             <w:pPr>
@@ -35,7 +35,7 @@
                 <w:rFonts w:ascii="Times New Roman" w:hAnsi="Times New Roman"/>
                 <w:b/>
                 <w:i w:val="0"/>
-                <w:sz w:val="22"/>
+                <w:sz w:val="21"/>
               </w:rPr>
               <w:t>SỞ GIÁO DỤC &amp; ĐÀO TẠO TP HUẾ</w:t>
               <w:br/>
@@ -48,7 +48,7 @@
                 <w:b/>
                 <w:i w:val="0"/>
                 <w:color w:val="2E7D32"/>
-                <w:sz w:val="22"/>
+                <w:sz w:val="21"/>
               </w:rPr>
               <w:t>Mã đề thi: 209</w:t>
             </w:r>
@@ -56,7 +56,7 @@
         </w:tc>
         <w:tc>
           <w:tcPr>
-            <w:tcW w:type="dxa" w:w="5953"/>
+            <w:tcW w:type="dxa" w:w="6520"/>
           </w:tcPr>
           <w:p>
             <w:pPr>
@@ -68,11 +68,11 @@
                 <w:rFonts w:ascii="Times New Roman" w:hAnsi="Times New Roman"/>
                 <w:b/>
                 <w:i w:val="0"/>
-                <w:sz w:val="22"/>
+                <w:sz w:val="21"/>
               </w:rPr>
               <w:t>ĐỀ KIỂM TRA CUỐI KÌ II - NĂM HỌC 2024-2025</w:t>
               <w:br/>
-              <w:t>MÔN HÓA HỌC LỚP 11</w:t>
+              <w:t>MÔN: HÓA HỌC 11</w:t>
               <w:br/>
             </w:r>
             <w:r>
@@ -80,9 +80,9 @@
                 <w:rFonts w:ascii="Times New Roman" w:hAnsi="Times New Roman"/>
                 <w:b w:val="0"/>
                 <w:i/>
-                <w:sz w:val="21"/>
+                <w:sz w:val="20"/>
               </w:rPr>
-              <w:t>Thời gian làm bài: 45 phút (không kể thời gian phát đề)</w:t>
+              <w:t>Thời gian làm bài: 45 phút (không kể phát đề)</w:t>
             </w:r>
           </w:p>
         </w:tc>

</xml_diff>

<commit_message>
Can chinh file Word chuan theo Page Setup va Tab stops: A4, Header/Footer 0.6cm, Tab 0.5-1.5-5-9.5-14cm
</commit_message>
<xml_diff>
--- a/San_Pham/De_Kiem_Tra_Hoa_11_Ma209.docx
+++ b/San_Pham/De_Kiem_Tra_Hoa_11_Ma209.docx
@@ -17,8 +17,8 @@
         </w:tblBorders>
       </w:tblPr>
       <w:tblGrid>
-        <w:gridCol w:w="5270"/>
-        <w:gridCol w:w="5270"/>
+        <w:gridCol w:w="5103"/>
+        <w:gridCol w:w="5103"/>
       </w:tblGrid>
       <w:tr>
         <w:tc>
@@ -253,9 +253,10 @@
       <w:pPr>
         <w:tabs>
           <w:tab w:pos="283" w:val="left"/>
-          <w:tab w:pos="2721" w:val="left"/>
-          <w:tab w:pos="5216" w:val="left"/>
-          <w:tab w:pos="7710" w:val="left"/>
+          <w:tab w:pos="850" w:val="left"/>
+          <w:tab w:pos="2835" w:val="left"/>
+          <w:tab w:pos="5386" w:val="left"/>
+          <w:tab w:pos="7937" w:val="left"/>
         </w:tabs>
         <w:spacing w:before="0" w:after="40" w:line="276" w:lineRule="auto"/>
       </w:pPr>
@@ -281,6 +282,7 @@
         <w:t xml:space="preserve">0,1  </w:t>
       </w:r>
       <w:r>
+        <w:tab/>
         <w:tab/>
       </w:r>
       <w:r>
@@ -371,9 +373,10 @@
       <w:pPr>
         <w:tabs>
           <w:tab w:pos="283" w:val="left"/>
-          <w:tab w:pos="2721" w:val="left"/>
-          <w:tab w:pos="5216" w:val="left"/>
-          <w:tab w:pos="7710" w:val="left"/>
+          <w:tab w:pos="850" w:val="left"/>
+          <w:tab w:pos="2835" w:val="left"/>
+          <w:tab w:pos="5386" w:val="left"/>
+          <w:tab w:pos="7937" w:val="left"/>
         </w:tabs>
         <w:spacing w:before="0" w:after="40" w:line="276" w:lineRule="auto"/>
       </w:pPr>
@@ -399,6 +402,7 @@
         <w:t xml:space="preserve">1  </w:t>
       </w:r>
       <w:r>
+        <w:tab/>
         <w:tab/>
       </w:r>
       <w:r>
@@ -508,9 +512,10 @@
       <w:pPr>
         <w:tabs>
           <w:tab w:pos="283" w:val="left"/>
-          <w:tab w:pos="2721" w:val="left"/>
-          <w:tab w:pos="5216" w:val="left"/>
-          <w:tab w:pos="7710" w:val="left"/>
+          <w:tab w:pos="850" w:val="left"/>
+          <w:tab w:pos="2835" w:val="left"/>
+          <w:tab w:pos="5386" w:val="left"/>
+          <w:tab w:pos="7937" w:val="left"/>
         </w:tabs>
         <w:spacing w:before="0" w:after="40" w:line="276" w:lineRule="auto"/>
       </w:pPr>
@@ -759,9 +764,10 @@
       <w:pPr>
         <w:tabs>
           <w:tab w:pos="283" w:val="left"/>
-          <w:tab w:pos="2721" w:val="left"/>
-          <w:tab w:pos="5216" w:val="left"/>
-          <w:tab w:pos="7710" w:val="left"/>
+          <w:tab w:pos="850" w:val="left"/>
+          <w:tab w:pos="2835" w:val="left"/>
+          <w:tab w:pos="5386" w:val="left"/>
+          <w:tab w:pos="7937" w:val="left"/>
         </w:tabs>
         <w:spacing w:before="0" w:after="40" w:line="276" w:lineRule="auto"/>
       </w:pPr>
@@ -787,6 +793,7 @@
         <w:t xml:space="preserve">1  </w:t>
       </w:r>
       <w:r>
+        <w:tab/>
         <w:tab/>
       </w:r>
       <w:r>
@@ -877,7 +884,10 @@
       <w:pPr>
         <w:tabs>
           <w:tab w:pos="283" w:val="left"/>
-          <w:tab w:pos="5216" w:val="left"/>
+          <w:tab w:pos="850" w:val="left"/>
+          <w:tab w:pos="2835" w:val="left"/>
+          <w:tab w:pos="5386" w:val="left"/>
+          <w:tab w:pos="7937" w:val="left"/>
         </w:tabs>
         <w:spacing w:before="0" w:after="20" w:line="276" w:lineRule="auto"/>
       </w:pPr>
@@ -928,7 +938,10 @@
       <w:pPr>
         <w:tabs>
           <w:tab w:pos="283" w:val="left"/>
-          <w:tab w:pos="5216" w:val="left"/>
+          <w:tab w:pos="850" w:val="left"/>
+          <w:tab w:pos="2835" w:val="left"/>
+          <w:tab w:pos="5386" w:val="left"/>
+          <w:tab w:pos="7937" w:val="left"/>
         </w:tabs>
         <w:spacing w:before="0" w:after="40" w:line="276" w:lineRule="auto"/>
       </w:pPr>
@@ -1019,7 +1032,7 @@
                     <pic:cNvPicPr/>
                   </pic:nvPicPr>
                   <pic:blipFill>
-                    <a:blip r:embed="rId13"/>
+                    <a:blip r:embed="rId11"/>
                     <a:stretch>
                       <a:fillRect/>
                     </a:stretch>
@@ -1042,9 +1055,10 @@
       <w:pPr>
         <w:tabs>
           <w:tab w:pos="283" w:val="left"/>
-          <w:tab w:pos="2721" w:val="left"/>
-          <w:tab w:pos="5216" w:val="left"/>
-          <w:tab w:pos="7710" w:val="left"/>
+          <w:tab w:pos="850" w:val="left"/>
+          <w:tab w:pos="2835" w:val="left"/>
+          <w:tab w:pos="5386" w:val="left"/>
+          <w:tab w:pos="7937" w:val="left"/>
         </w:tabs>
         <w:spacing w:before="0" w:after="40" w:line="276" w:lineRule="auto"/>
       </w:pPr>
@@ -1177,7 +1191,7 @@
                     <pic:cNvPicPr/>
                   </pic:nvPicPr>
                   <pic:blipFill>
-                    <a:blip r:embed="rId14"/>
+                    <a:blip r:embed="rId12"/>
                     <a:stretch>
                       <a:fillRect/>
                     </a:stretch>
@@ -1214,6 +1228,10 @@
       <w:pPr>
         <w:tabs>
           <w:tab w:pos="283" w:val="left"/>
+          <w:tab w:pos="850" w:val="left"/>
+          <w:tab w:pos="2835" w:val="left"/>
+          <w:tab w:pos="5386" w:val="left"/>
+          <w:tab w:pos="7937" w:val="left"/>
         </w:tabs>
         <w:spacing w:before="0" w:after="20" w:line="276" w:lineRule="auto"/>
       </w:pPr>
@@ -1243,6 +1261,10 @@
       <w:pPr>
         <w:tabs>
           <w:tab w:pos="283" w:val="left"/>
+          <w:tab w:pos="850" w:val="left"/>
+          <w:tab w:pos="2835" w:val="left"/>
+          <w:tab w:pos="5386" w:val="left"/>
+          <w:tab w:pos="7937" w:val="left"/>
         </w:tabs>
         <w:spacing w:before="0" w:after="20" w:line="276" w:lineRule="auto"/>
       </w:pPr>
@@ -1272,6 +1294,10 @@
       <w:pPr>
         <w:tabs>
           <w:tab w:pos="283" w:val="left"/>
+          <w:tab w:pos="850" w:val="left"/>
+          <w:tab w:pos="2835" w:val="left"/>
+          <w:tab w:pos="5386" w:val="left"/>
+          <w:tab w:pos="7937" w:val="left"/>
         </w:tabs>
         <w:spacing w:before="0" w:after="20" w:line="276" w:lineRule="auto"/>
       </w:pPr>
@@ -1301,6 +1327,10 @@
       <w:pPr>
         <w:tabs>
           <w:tab w:pos="283" w:val="left"/>
+          <w:tab w:pos="850" w:val="left"/>
+          <w:tab w:pos="2835" w:val="left"/>
+          <w:tab w:pos="5386" w:val="left"/>
+          <w:tab w:pos="7937" w:val="left"/>
         </w:tabs>
         <w:spacing w:before="0" w:after="40" w:line="276" w:lineRule="auto"/>
       </w:pPr>
@@ -1553,9 +1583,10 @@
       <w:pPr>
         <w:tabs>
           <w:tab w:pos="283" w:val="left"/>
-          <w:tab w:pos="2721" w:val="left"/>
-          <w:tab w:pos="5216" w:val="left"/>
-          <w:tab w:pos="7710" w:val="left"/>
+          <w:tab w:pos="850" w:val="left"/>
+          <w:tab w:pos="2835" w:val="left"/>
+          <w:tab w:pos="5386" w:val="left"/>
+          <w:tab w:pos="7937" w:val="left"/>
         </w:tabs>
         <w:spacing w:before="0" w:after="40" w:line="276" w:lineRule="auto"/>
       </w:pPr>
@@ -1814,7 +1845,10 @@
       <w:pPr>
         <w:tabs>
           <w:tab w:pos="283" w:val="left"/>
-          <w:tab w:pos="5216" w:val="left"/>
+          <w:tab w:pos="850" w:val="left"/>
+          <w:tab w:pos="2835" w:val="left"/>
+          <w:tab w:pos="5386" w:val="left"/>
+          <w:tab w:pos="7937" w:val="left"/>
         </w:tabs>
         <w:spacing w:before="0" w:after="20" w:line="276" w:lineRule="auto"/>
       </w:pPr>
@@ -1865,7 +1899,10 @@
       <w:pPr>
         <w:tabs>
           <w:tab w:pos="283" w:val="left"/>
-          <w:tab w:pos="5216" w:val="left"/>
+          <w:tab w:pos="850" w:val="left"/>
+          <w:tab w:pos="2835" w:val="left"/>
+          <w:tab w:pos="5386" w:val="left"/>
+          <w:tab w:pos="7937" w:val="left"/>
         </w:tabs>
         <w:spacing w:before="0" w:after="40" w:line="276" w:lineRule="auto"/>
       </w:pPr>
@@ -1978,7 +2015,10 @@
       <w:pPr>
         <w:tabs>
           <w:tab w:pos="283" w:val="left"/>
-          <w:tab w:pos="5216" w:val="left"/>
+          <w:tab w:pos="850" w:val="left"/>
+          <w:tab w:pos="2835" w:val="left"/>
+          <w:tab w:pos="5386" w:val="left"/>
+          <w:tab w:pos="7937" w:val="left"/>
         </w:tabs>
         <w:spacing w:before="0" w:after="20" w:line="276" w:lineRule="auto"/>
       </w:pPr>
@@ -2105,7 +2145,10 @@
       <w:pPr>
         <w:tabs>
           <w:tab w:pos="283" w:val="left"/>
-          <w:tab w:pos="5216" w:val="left"/>
+          <w:tab w:pos="850" w:val="left"/>
+          <w:tab w:pos="2835" w:val="left"/>
+          <w:tab w:pos="5386" w:val="left"/>
+          <w:tab w:pos="7937" w:val="left"/>
         </w:tabs>
         <w:spacing w:before="0" w:after="40" w:line="276" w:lineRule="auto"/>
       </w:pPr>
@@ -2272,7 +2315,7 @@
                     <pic:cNvPicPr/>
                   </pic:nvPicPr>
                   <pic:blipFill>
-                    <a:blip r:embed="rId15"/>
+                    <a:blip r:embed="rId13"/>
                     <a:stretch>
                       <a:fillRect/>
                     </a:stretch>
@@ -2309,9 +2352,10 @@
       <w:pPr>
         <w:tabs>
           <w:tab w:pos="283" w:val="left"/>
-          <w:tab w:pos="2721" w:val="left"/>
-          <w:tab w:pos="5216" w:val="left"/>
-          <w:tab w:pos="7710" w:val="left"/>
+          <w:tab w:pos="850" w:val="left"/>
+          <w:tab w:pos="2835" w:val="left"/>
+          <w:tab w:pos="5386" w:val="left"/>
+          <w:tab w:pos="7937" w:val="left"/>
         </w:tabs>
         <w:spacing w:before="0" w:after="40" w:line="276" w:lineRule="auto"/>
       </w:pPr>
@@ -2427,9 +2471,10 @@
       <w:pPr>
         <w:tabs>
           <w:tab w:pos="283" w:val="left"/>
-          <w:tab w:pos="2721" w:val="left"/>
-          <w:tab w:pos="5216" w:val="left"/>
-          <w:tab w:pos="7710" w:val="left"/>
+          <w:tab w:pos="850" w:val="left"/>
+          <w:tab w:pos="2835" w:val="left"/>
+          <w:tab w:pos="5386" w:val="left"/>
+          <w:tab w:pos="7937" w:val="left"/>
         </w:tabs>
         <w:spacing w:before="0" w:after="40" w:line="276" w:lineRule="auto"/>
       </w:pPr>
@@ -2754,6 +2799,10 @@
       <w:pPr>
         <w:tabs>
           <w:tab w:pos="283" w:val="left"/>
+          <w:tab w:pos="850" w:val="left"/>
+          <w:tab w:pos="2835" w:val="left"/>
+          <w:tab w:pos="5386" w:val="left"/>
+          <w:tab w:pos="7937" w:val="left"/>
         </w:tabs>
         <w:spacing w:before="0" w:after="40" w:line="276" w:lineRule="auto"/>
       </w:pPr>
@@ -2783,6 +2832,10 @@
       <w:pPr>
         <w:tabs>
           <w:tab w:pos="283" w:val="left"/>
+          <w:tab w:pos="850" w:val="left"/>
+          <w:tab w:pos="2835" w:val="left"/>
+          <w:tab w:pos="5386" w:val="left"/>
+          <w:tab w:pos="7937" w:val="left"/>
         </w:tabs>
         <w:spacing w:before="0" w:after="40" w:line="276" w:lineRule="auto"/>
       </w:pPr>
@@ -2812,6 +2865,10 @@
       <w:pPr>
         <w:tabs>
           <w:tab w:pos="283" w:val="left"/>
+          <w:tab w:pos="850" w:val="left"/>
+          <w:tab w:pos="2835" w:val="left"/>
+          <w:tab w:pos="5386" w:val="left"/>
+          <w:tab w:pos="7937" w:val="left"/>
         </w:tabs>
         <w:spacing w:before="0" w:after="40" w:line="276" w:lineRule="auto"/>
       </w:pPr>
@@ -2841,6 +2898,10 @@
       <w:pPr>
         <w:tabs>
           <w:tab w:pos="283" w:val="left"/>
+          <w:tab w:pos="850" w:val="left"/>
+          <w:tab w:pos="2835" w:val="left"/>
+          <w:tab w:pos="5386" w:val="left"/>
+          <w:tab w:pos="7937" w:val="left"/>
         </w:tabs>
         <w:spacing w:before="0" w:after="40" w:line="276" w:lineRule="auto"/>
       </w:pPr>
@@ -2912,6 +2973,10 @@
       <w:pPr>
         <w:tabs>
           <w:tab w:pos="283" w:val="left"/>
+          <w:tab w:pos="850" w:val="left"/>
+          <w:tab w:pos="2835" w:val="left"/>
+          <w:tab w:pos="5386" w:val="left"/>
+          <w:tab w:pos="7937" w:val="left"/>
         </w:tabs>
         <w:spacing w:before="0" w:after="40" w:line="276" w:lineRule="auto"/>
       </w:pPr>
@@ -2979,6 +3044,10 @@
       <w:pPr>
         <w:tabs>
           <w:tab w:pos="283" w:val="left"/>
+          <w:tab w:pos="850" w:val="left"/>
+          <w:tab w:pos="2835" w:val="left"/>
+          <w:tab w:pos="5386" w:val="left"/>
+          <w:tab w:pos="7937" w:val="left"/>
         </w:tabs>
         <w:spacing w:before="0" w:after="40" w:line="276" w:lineRule="auto"/>
       </w:pPr>
@@ -3046,6 +3115,10 @@
       <w:pPr>
         <w:tabs>
           <w:tab w:pos="283" w:val="left"/>
+          <w:tab w:pos="850" w:val="left"/>
+          <w:tab w:pos="2835" w:val="left"/>
+          <w:tab w:pos="5386" w:val="left"/>
+          <w:tab w:pos="7937" w:val="left"/>
         </w:tabs>
         <w:spacing w:before="0" w:after="40" w:line="276" w:lineRule="auto"/>
       </w:pPr>
@@ -3132,6 +3205,10 @@
       <w:pPr>
         <w:tabs>
           <w:tab w:pos="283" w:val="left"/>
+          <w:tab w:pos="850" w:val="left"/>
+          <w:tab w:pos="2835" w:val="left"/>
+          <w:tab w:pos="5386" w:val="left"/>
+          <w:tab w:pos="7937" w:val="left"/>
         </w:tabs>
         <w:spacing w:before="0" w:after="40" w:line="276" w:lineRule="auto"/>
       </w:pPr>
@@ -3372,7 +3449,7 @@
                     <pic:cNvPicPr/>
                   </pic:nvPicPr>
                   <pic:blipFill>
-                    <a:blip r:embed="rId16"/>
+                    <a:blip r:embed="rId14"/>
                     <a:stretch>
                       <a:fillRect/>
                     </a:stretch>
@@ -3445,7 +3522,7 @@
                     <pic:cNvPicPr/>
                   </pic:nvPicPr>
                   <pic:blipFill>
-                    <a:blip r:embed="rId16"/>
+                    <a:blip r:embed="rId14"/>
                     <a:stretch>
                       <a:fillRect/>
                     </a:stretch>
@@ -3565,7 +3642,7 @@
                     <pic:cNvPicPr/>
                   </pic:nvPicPr>
                   <pic:blipFill>
-                    <a:blip r:embed="rId16"/>
+                    <a:blip r:embed="rId14"/>
                     <a:stretch>
                       <a:fillRect/>
                     </a:stretch>
@@ -3837,7 +3914,7 @@
                     <pic:cNvPicPr/>
                   </pic:nvPicPr>
                   <pic:blipFill>
-                    <a:blip r:embed="rId16"/>
+                    <a:blip r:embed="rId14"/>
                     <a:stretch>
                       <a:fillRect/>
                     </a:stretch>
@@ -4530,13 +4607,11 @@
     <w:sectPr>
       <w:headerReference w:type="default" r:id="rId9"/>
       <w:footerReference w:type="default" r:id="rId10"/>
-      <w:headerReference w:type="first" r:id="rId11"/>
-      <w:footerReference w:type="first" r:id="rId12"/>
-      <w:pgSz w:w="12240" w:h="15840"/>
-      <w:pgMar w:top="850" w:right="850" w:bottom="850" w:left="850" w:header="720" w:footer="720" w:gutter="0"/>
+      <w:pgSz w:w="11906" w:h="16838"/>
+      <w:pgMar w:top="850" w:right="850" w:bottom="850" w:left="850" w:header="340" w:footer="340" w:gutter="0"/>
       <w:cols w:space="720"/>
-      <w:titlePg/>
       <w:docGrid w:linePitch="360"/>
+      <w:vAlign w:val="top"/>
     </w:sectPr>
   </w:body>
 </w:document>
@@ -4555,59 +4630,7 @@
         <w:top w:val="single" w:sz="8" w:space="4" w:color="8BC390"/>
       </w:pBdr>
     </w:pPr>
-    <w:r>
-      <w:rPr>
-        <w:rFonts w:ascii="Times New Roman" w:hAnsi="Times New Roman"/>
-        <w:b w:val="0"/>
-        <w:i/>
-        <w:color w:val="D32F2F"/>
-        <w:sz w:val="19"/>
-      </w:rPr>
-      <w:t>CS1: 6/15 Nguyễn Hoàng, P. Kim Long, TP Huế | CS2: 24 Đặng Thái Thân, TP Huế</w:t>
-    </w:r>
-    <w:r>
-      <w:tab/>
-    </w:r>
-    <w:r>
-      <w:rPr>
-        <w:rFonts w:ascii="Times New Roman" w:hAnsi="Times New Roman"/>
-        <w:b/>
-        <w:i w:val="0"/>
-        <w:color w:val="D32F2F"/>
-        <w:sz w:val="20"/>
-      </w:rPr>
-      <w:t xml:space="preserve">Trang </w:t>
-    </w:r>
-    <w:r>
-      <w:rPr>
-        <w:rFonts w:ascii="Times New Roman" w:hAnsi="Times New Roman"/>
-        <w:b/>
-        <w:i w:val="0"/>
-        <w:color w:val="D32F2F"/>
-        <w:sz w:val="20"/>
-      </w:rPr>
-      <w:fldChar w:fldCharType="begin"/>
-      <w:instrText xml:space="preserve"> PAGE </w:instrText>
-      <w:fldChar w:fldCharType="separate"/>
-      <w:fldChar w:fldCharType="end"/>
-    </w:r>
-  </w:p>
-</w:ftr>
-</file>
-
-<file path=word/footer2.xml><?xml version="1.0" encoding="utf-8"?>
-<w:ftr xmlns:m="http://schemas.openxmlformats.org/officeDocument/2006/math" xmlns:mc="http://schemas.openxmlformats.org/markup-compatibility/2006" xmlns:mo="http://schemas.microsoft.com/office/mac/office/2008/main" xmlns:mv="urn:schemas-microsoft-com:mac:vml" xmlns:o="urn:schemas-microsoft-com:office:office" xmlns:r="http://schemas.openxmlformats.org/officeDocument/2006/relationships" xmlns:v="urn:schemas-microsoft-com:vml" xmlns:w10="urn:schemas-microsoft-com:office:word" xmlns:w14="http://schemas.microsoft.com/office/word/2010/wordml" xmlns:w="http://schemas.openxmlformats.org/wordprocessingml/2006/main" xmlns:wne="http://schemas.microsoft.com/office/word/2006/wordml" xmlns:wp14="http://schemas.microsoft.com/office/word/2010/wordprocessingDrawing" xmlns:wp="http://schemas.openxmlformats.org/drawingml/2006/wordprocessingDrawing" xmlns:wpc="http://schemas.microsoft.com/office/word/2010/wordprocessingCanvas" xmlns:wpg="http://schemas.microsoft.com/office/word/2010/wordprocessingGroup" xmlns:wpi="http://schemas.microsoft.com/office/word/2010/wordprocessingInk" xmlns:wps="http://schemas.microsoft.com/office/word/2010/wordprocessingShape" mc:Ignorable="w14 wp14">
-  <w:p>
-    <w:pPr>
-      <w:pStyle w:val="Footer"/>
-      <w:tabs>
-        <w:tab w:pos="10205" w:val="right"/>
-      </w:tabs>
-      <w:spacing w:before="80" w:after="0"/>
-      <w:pBdr>
-        <w:top w:val="single" w:sz="8" w:space="4" w:color="8BC390"/>
-      </w:pBdr>
-    </w:pPr>
+    <w:r/>
     <w:r>
       <w:rPr>
         <w:rFonts w:ascii="Times New Roman" w:hAnsi="Times New Roman"/>
@@ -4661,6 +4684,7 @@
         <w:bottom w:val="single" w:sz="8" w:space="4" w:color="8BC390"/>
       </w:pBdr>
     </w:pPr>
+    <w:r/>
     <w:r>
       <w:rPr>
         <w:rFonts w:ascii="Times New Roman" w:hAnsi="Times New Roman"/>
@@ -4704,17 +4728,6 @@
       </w:rPr>
       <w:t xml:space="preserve"> - 0777.470.803</w:t>
     </w:r>
-  </w:p>
-</w:hdr>
-</file>
-
-<file path=word/header2.xml><?xml version="1.0" encoding="utf-8"?>
-<w:hdr xmlns:m="http://schemas.openxmlformats.org/officeDocument/2006/math" xmlns:mc="http://schemas.openxmlformats.org/markup-compatibility/2006" xmlns:mo="http://schemas.microsoft.com/office/mac/office/2008/main" xmlns:mv="urn:schemas-microsoft-com:mac:vml" xmlns:o="urn:schemas-microsoft-com:office:office" xmlns:r="http://schemas.openxmlformats.org/officeDocument/2006/relationships" xmlns:v="urn:schemas-microsoft-com:vml" xmlns:w10="urn:schemas-microsoft-com:office:word" xmlns:w14="http://schemas.microsoft.com/office/word/2010/wordml" xmlns:w="http://schemas.openxmlformats.org/wordprocessingml/2006/main" xmlns:wne="http://schemas.microsoft.com/office/word/2006/wordml" xmlns:wp14="http://schemas.microsoft.com/office/word/2010/wordprocessingDrawing" xmlns:wp="http://schemas.openxmlformats.org/drawingml/2006/wordprocessingDrawing" xmlns:wpc="http://schemas.microsoft.com/office/word/2010/wordprocessingCanvas" xmlns:wpg="http://schemas.microsoft.com/office/word/2010/wordprocessingGroup" xmlns:wpi="http://schemas.microsoft.com/office/word/2010/wordprocessingInk" xmlns:wps="http://schemas.microsoft.com/office/word/2010/wordprocessingShape" mc:Ignorable="w14 wp14">
-  <w:p>
-    <w:pPr>
-      <w:pStyle w:val="Header"/>
-    </w:pPr>
-    <w:r/>
   </w:p>
 </w:hdr>
 </file>
@@ -5082,6 +5095,15 @@
     <w:name w:val="Normal"/>
     <w:qFormat/>
     <w:rsid w:val="00FC693F"/>
+    <w:pPr>
+      <w:tabs>
+        <w:tab w:pos="283" w:val="left"/>
+        <w:tab w:pos="850" w:val="left"/>
+        <w:tab w:pos="2835" w:val="left"/>
+        <w:tab w:pos="5386" w:val="left"/>
+        <w:tab w:pos="7937" w:val="left"/>
+      </w:tabs>
+    </w:pPr>
   </w:style>
   <w:style w:type="paragraph" w:styleId="Header">
     <w:name w:val="header"/>

</xml_diff>